<commit_message>
Simplificar ficha: remover ícones e cores excessivas
</commit_message>
<xml_diff>
--- a/FICHA_RESPOSTA_AR_Regulamento_2023_0447.docx
+++ b/FICHA_RESPOSTA_AR_Regulamento_2023_0447.docx
@@ -10,7 +10,6 @@
         <w:rPr>
           <w:rFonts w:ascii="Calibri" w:hAnsi="Calibri"/>
           <w:b/>
-          <w:color w:val="003366"/>
           <w:sz w:val="26"/>
         </w:rPr>
         <w:t>FICHA TÉCNICA DE RESPOSTA A INQUIRIÇÃO PARLAMENTAR</w:t>
@@ -24,7 +23,6 @@
         <w:rPr>
           <w:rFonts w:ascii="Calibri" w:hAnsi="Calibri"/>
           <w:b/>
-          <w:color w:val="333333"/>
           <w:sz w:val="22"/>
         </w:rPr>
         <w:t>Análise Comparativa da Legislação sobre Bem-Estar de Animais de Companhia</w:t>
@@ -39,7 +37,6 @@
       <w:r>
         <w:rPr>
           <w:i/>
-          <w:color w:val="646464"/>
           <w:sz w:val="18"/>
         </w:rPr>
         <w:t>Documento de apoio da DGAV para inquirição da Assembleia da República</w:t>
@@ -50,7 +47,7 @@
     <w:p/>
     <w:tbl>
       <w:tblPr>
-        <w:tblStyle w:val="LightGrid-Accent1"/>
+        <w:tblStyle w:val="TableGrid"/>
         <w:tblW w:type="auto" w:w="0"/>
         <w:tblLook w:firstColumn="1" w:firstRow="1" w:lastColumn="0" w:lastRow="0" w:noHBand="0" w:noVBand="1" w:val="04A0"/>
       </w:tblPr>
@@ -62,13 +59,12 @@
         <w:tc>
           <w:tcPr>
             <w:tcW w:type="dxa" w:w="1984"/>
-            <w:shd w:fill="D5E8F7"/>
+            <w:shd w:fill="CCCCCC"/>
           </w:tcPr>
           <w:p>
             <w:r>
               <w:rPr>
                 <w:b/>
-                <w:color w:val="003366"/>
               </w:rPr>
               <w:t>Designação</w:t>
             </w:r>
@@ -77,13 +73,12 @@
         <w:tc>
           <w:tcPr>
             <w:tcW w:type="dxa" w:w="6236"/>
-            <w:shd w:fill="D5E8F7"/>
+            <w:shd w:fill="CCCCCC"/>
           </w:tcPr>
           <w:p>
             <w:r>
               <w:rPr>
                 <w:b/>
-                <w:color w:val="003366"/>
               </w:rPr>
               <w:t>Conteúdo</w:t>
             </w:r>
@@ -94,7 +89,6 @@
         <w:tc>
           <w:tcPr>
             <w:tcW w:type="dxa" w:w="1984"/>
-            <w:shd w:fill="E8F4F8"/>
           </w:tcPr>
           <w:p>
             <w:r>
@@ -117,10 +111,10 @@
                 <w:rFonts w:ascii="Calibri" w:hAnsi="Calibri"/>
                 <w:sz w:val="20"/>
               </w:rPr>
-              <w:t>O Regulamento (UE) 2023/0447, relativo ao bem-estar de cães e gatos e à sua rastreabilidade, encontra-se em fase de consolidação legislativa europeia, com expectativa de aprovação final em 2026. Simultaneamente, a Direção-Geral de Alimentação e Veterinária (DGAV) procede a uma análise aprofundada da legislação portuguesa vigente para:  (i) avaliar a compatibilidade do ordenamento nacional com as novas normas europeias; (ii) identificar lacunas normativas e remissões críticas; (iii) preparar a consolidação legislativa nacional, que deverá incluir os regimes contidos no Código do Animal, na proposta de Regime Geral do Bem-Estar dos Animais de Companhia (RGBEAC) e em diplomas legislativos anteriores.</w:t>
+              <w:t>O Regulamento (UE) 2023/0447, relativo ao bem-estar de cães e gatos e à sua rastreabilidade, encontra-se em fase de consolidação legislativa europeia. Simultaneamente, a Direção-Geral de Alimentação e Veterinária (DGAV) procede a uma análise aprofundada da legislação portuguesa vigente para: (i) avaliar a compatibilidade do ordenamento nacional com as novas normas europeias; (ii) identificar lacunas normativas e remissões críticas; (iii) preparar a consolidação legislativa nacional, que deverá integrar os regimes contidos no Código do Animal, na proposta de Regime Geral do Bem-Estar dos Animais de Companhia (RGBEAC) e em diplomas legislativos anteriores.</w:t>
               <w:br/>
               <w:br/>
-              <w:t>Este processo é complexo e multidisciplinar, envolvendo não apenas a compatibilização de 19 diplomas legislativos de diferentes épocas, como também o alinhamento com as normas europeias de aplicação direta. A morosidade relativa reflecte a necessidade de um trabalho metodológico estruturado, que garanta coerência jurídica e evite sobreposições ou contradições que possam prejudicar os destinatários da proteção — os próprios animais e os operadores económicos afectados.</w:t>
+              <w:t>Este processo é complexo e multidisciplinar, envolvendo a compatibilização de 19 diplomas legislativos de diferentes épocas, aliado ao alinhamento com as normas europeias de aplicação direta. A morosidade relativa reflecte a necessidade de um trabalho metodológico estruturado, que garanta coerência jurídica e evite sobreposições ou contradições que possam prejudicar os destinatários da proteção — os próprios animais e os operadores económicos afectados.</w:t>
             </w:r>
           </w:p>
         </w:tc>
@@ -129,7 +123,6 @@
         <w:tc>
           <w:tcPr>
             <w:tcW w:type="dxa" w:w="1984"/>
-            <w:shd w:fill="E8F4F8"/>
           </w:tcPr>
           <w:p>
             <w:r>
@@ -152,22 +145,22 @@
                 <w:rFonts w:ascii="Calibri" w:hAnsi="Calibri"/>
                 <w:sz w:val="20"/>
               </w:rPr>
-              <w:t>📌 FASE DE INVESTIGAÇÃO COMPLETA</w:t>
+              <w:t>FASE DE INVESTIGAÇÃO COMPLETA</w:t>
               <w:br/>
               <w:br/>
-              <w:t>A DGAV concluiu a investigação exaustiva da legislação portuguesa vigente sobre bem-estar e proteção de animais, com identificação de 19 diplomas relevantes, abrangendo:  • Legislação geral de proteção (Lei 92/95, Lei 8/2017)  • Bem-estar de animais de companhia (DL 276/2001, DL 82/2019)  • Identificação e rastreabilidade SIAC (DL 82/2019)  • Animais errantes e centros de recolha (Lei 27/2016)  • Animais perigosos (DL 315/2009)  • Raiva e zoonoses (DL 314/2003, Port. 264/2013)  • Comércio de animais (Lei 95/2017)  • Cães de assistência (DL 74/2007)  • Circos e espetáculos (Lei 20/2019)</w:t>
+              <w:t>A DGAV concluiu a investigação exaustiva da legislação portuguesa vigente sobre bem-estar e proteção de animais, com identificação de 19 diplomas relevantes, abrangendo: Legislação geral de proteção (Lei 92/95, Lei 8/2017); Bem-estar de animais de companhia (DL 276/2001, DL 82/2019); Identificação e rastreabilidade SIAC (DL 82/2019); Animais errantes e centros de recolha (Lei 27/2016); Animais perigosos (DL 315/2009); Raiva e zoonoses (DL 314/2003, Port. 264/2013); Comércio de animais (Lei 95/2017); Cães de assistência (DL 74/2007); Circos e espetáculos (Lei 20/2019).</w:t>
               <w:br/>
               <w:br/>
-              <w:t>📊 PROGRESSO NA ANÁLISE COMPARATIVA</w:t>
+              <w:t>PROGRESSO NA ANÁLISE COMPARATIVA</w:t>
               <w:br/>
               <w:br/>
-              <w:t>Análise artigo a artigo do Regulamento 2023/0447 (21 artigos relevantes) em confronto com legislação portuguesa vigente, proposta RGBEAC e Código do Animal.  ✅ Mapeadas correspondências entre Regulamento e diplomas nacionais  ✅ Identificadas divergências, sobreposições e lacunas normativas  ✅ Geradas ferramentas de análise (Excel comparativo, documentos estruturados)  ⏳ Análise de impacto normativo em fase de consolidação</w:t>
+              <w:t>Análise artigo a artigo do Regulamento 2023/0447 (21 artigos relevantes) em confronto com legislação portuguesa vigente, proposta RGBEAC e Código do Animal. Mapeadas correspondências entre Regulamento e diplomas nacionais. Identificadas divergências, sobreposições e lacunas normativas. Geradas ferramentas de análise (Excel comparativo, documentos estruturados). Análise de impacto normativo em fase de consolidação.</w:t>
               <w:br/>
               <w:br/>
-              <w:t>🔄 AGUARDANDO CONSOLIDAÇÃO LEGISLATIVA EUROPEIA</w:t>
+              <w:t>AGUARDANDO CONSOLIDAÇÃO LEGISLATIVA EUROPEIA</w:t>
               <w:br/>
               <w:br/>
-              <w:t>O processo de transposição e implementação nacional está dependente da conclusão da negociação europeia (Trilogue em curso), prevendo-se que o texto final será publicado no jornal Oficial da UE durante o segundo semestre de 2026.</w:t>
+              <w:t>O processo de transposição e implementação nacional está dependente da conclusão da negociação europeia (Trilogue em curso), prevendo-se que o texto final será publicado no Jornal Oficial da UE durante o segundo semestre de 2026.</w:t>
             </w:r>
           </w:p>
         </w:tc>
@@ -176,7 +169,6 @@
         <w:tc>
           <w:tcPr>
             <w:tcW w:type="dxa" w:w="1984"/>
-            <w:shd w:fill="FCE4D6"/>
           </w:tcPr>
           <w:p>
             <w:r>
@@ -197,27 +189,27 @@
                 <w:rFonts w:ascii="Calibri" w:hAnsi="Calibri"/>
                 <w:sz w:val="20"/>
               </w:rPr>
-              <w:t>⚠️  MOROSIDADE LEGISLATIVA EUROPEIA</w:t>
+              <w:t>MOROSIDADE LEGISLATIVA EUROPEIA</w:t>
               <w:br/>
               <w:t>O Regulamento 2023/0447 está em fase de consolidação há mais de dois anos. Esta demora impossibilita o cumprimento de calendários nacionais de implementação, mantendo a incerteza jurídica sobre o regime aplicável a operadores económicos (criadores, comerciantes, abrigos).</w:t>
               <w:br/>
               <w:br/>
-              <w:t>⚠️  COMPLEXIDADE NORMATIVA ACUMULADA</w:t>
+              <w:t>COMPLEXIDADE NORMATIVA ACUMULADA</w:t>
               <w:br/>
-              <w:t>A legislação portuguesa sobre animais de companhia é fragmentada em 19 diplomas de diferentes épocas, com remissões cruzadas, regimes transitórios específicos e overlaps substanciais. O Regulamento europeu introduz novos padrões que não podem ser simplesmente sobrepor-se; exigem uma reestruturação coerente do ordenamento nacional.</w:t>
+              <w:t>A legislação portuguesa sobre animais de companhia é fragmentada em 19 diplomas de diferentes épocas, com remissões cruzadas, regimes transitórios específicos e overlaps substanciais. O Regulamento europeu introduz novos padrões que não podem ser simplesmente sobrepostos; exigem uma reestruturação coerente do ordenamento nacional.</w:t>
               <w:br/>
               <w:br/>
-              <w:t>⚠️  CICLO DE ATUALIZAÇÃO CONTÍNUA</w:t>
+              <w:t>CICLO DE ATUALIZAÇÃO CONTÍNUA</w:t>
               <w:br/>
               <w:t>Durante a análise em curso, a proposta de Regulamento sofreu ajustamentos sucessivos. Cada alteração no texto europeu obriga a reanálise e atualização das correspondências nacionais, atrasando a consolidação final.</w:t>
               <w:br/>
               <w:br/>
-              <w:t>⚠️  EQUILIBRIO ENTRE INOVAÇÃO E VIABILIDADE OPERACIONAL</w:t>
+              <w:t>EQUILÍBRIO ENTRE INOVAÇÃO E VIABILIDADE OPERACIONAL</w:t>
               <w:br/>
               <w:t>O novo paradigma de proteção animal (reconhecimento de senciência, bem-estar aprofundado) é compatível com o objetivo, mas a sua implementação num contexto de serviços sobrecarregados (inspetores municipais, médicos veterinários, autoridades de bem-estar) exige cautela. Um regime sancionatório excessivamente restritivo no curto prazo pode gerar danos colaterais — eutanásias não necessárias, abandono de animais por impossibilidade de compliance, pressão sobre estruturas de acolhimento já saturadas — prejudicando precisamente os animais que se pretende proteger.</w:t>
               <w:br/>
               <w:br/>
-              <w:t>⚠️  CAPACIDADE FISCAL E ADMINISTRATIVA</w:t>
+              <w:t>CAPACIDADE FISCAL E ADMINISTRATIVA</w:t>
               <w:br/>
               <w:t>A implementação de novos requisitos (bases de dados de rastreabilidade, inspeção de operadores, programas de formação de cuidadores) implica investimento em infraestrutura técnica e pessoal especializado. Este investimento não foi ainda orçamentado nem assegurado.</w:t>
             </w:r>
@@ -228,7 +220,6 @@
         <w:tc>
           <w:tcPr>
             <w:tcW w:type="dxa" w:w="1984"/>
-            <w:shd w:fill="E8F4F8"/>
           </w:tcPr>
           <w:p>
             <w:r>
@@ -249,65 +240,47 @@
                 <w:rFonts w:ascii="Calibri" w:hAnsi="Calibri"/>
                 <w:sz w:val="20"/>
               </w:rPr>
-              <w:t>📋 LEGISLAÇÃO E DOCUMENTOS DE REFERÊNCIA</w:t>
+              <w:t>LEGISLAÇÃO E DOCUMENTOS DE REFERÊNCIA</w:t>
               <w:br/>
               <w:br/>
               <w:t>Diplomas principais (nacionais):</w:t>
               <w:br/>
-              <w:t>• Lei 92/95, de 12 de setembro — Proteção aos animais</w:t>
+              <w:t>Lei 92/95, de 12 de setembro — Proteção aos animais</w:t>
               <w:br/>
-              <w:t>• DL 276/2001, de 17 de outubro — Bem-estar de animais de companhia (Convenção Europeia)</w:t>
+              <w:t>DL 276/2001, de 17 de outubro — Bem-estar de animais de companhia</w:t>
               <w:br/>
-              <w:t>• DL 82/2019, de 27 de junho — Identificação e Sistema de Informação de Animais de Companhia (SIAC)</w:t>
+              <w:t>DL 82/2019, de 27 de junho — Identificação e Sistema de Informação de Animais de Companhia (SIAC)</w:t>
               <w:br/>
-              <w:t>• Lei 27/2016, de 23 de agosto — Rede de centros de recolha; proibição do abate</w:t>
+              <w:t>Lei 27/2016, de 23 de agosto — Rede de centros de recolha; proibição do abate</w:t>
               <w:br/>
-              <w:t>• Lei 95/2017, de 23 de agosto — Comércio de animais de companhia</w:t>
+              <w:t>Lei 95/2017, de 23 de agosto — Comércio de animais de companhia</w:t>
               <w:br/>
-              <w:t>• Lei 8/2017, de 3 de março — Estatuto jurídico dos animais (senciência)</w:t>
+              <w:t>Lei 8/2017, de 3 de março — Estatuto jurídico dos animais</w:t>
               <w:br/>
-              <w:t>• Lei 69/2014, de 29 de agosto + Lei 39/2020 — Crimes de maus-tratos</w:t>
+              <w:t>Lei 69/2014, de 29 de agosto e Lei 39/2020 — Crimes de maus-tratos</w:t>
               <w:br/>
               <w:br/>
               <w:t>Regulamento Europeu:</w:t>
               <w:br/>
-              <w:t>• Regulamento (UE) 2023/0447 (em consolidação) — Bem-estar de cães e gatos e rastreabilidade</w:t>
+              <w:t>Regulamento (UE) 2023/0447 — Bem-estar de cães e gatos e rastreabilidade</w:t>
               <w:br/>
               <w:br/>
-              <w:t>📊 ANÁLISE REALIZADA</w:t>
+              <w:t>ANÁLISE REALIZADA</w:t>
               <w:br/>
               <w:br/>
-              <w:t>✅ Mapeamento de 19 diplomas nacionais com identificação de tema, cobertura material e impacto esperado</w:t>
-              <w:br/>
-              <w:t>✅ Análise artigo-a-artigo de 21 artigos do Regulamento 2023/0447</w:t>
-              <w:br/>
-              <w:t>✅ Identificação de correspondências entre Regulamento e legislação nacional (@ RGBEAC, @ Código Animal, @ legislação vigente)</w:t>
-              <w:br/>
-              <w:t>✅ Mapeamento de 6 eixos de harmonização: (1) Detenção responsável; (2) Reprodução; (3) Rastreabilidade; (4) Animais errantes; (5) Saúde e bem-estar; (6) Comércio eletrônico</w:t>
-              <w:br/>
-              <w:t>✅ Geração de ferramentas de análise: Excel comparativo (artigo a artigo), documentação estruturada (divergências por tema), scripts de integração para atualização contínua</w:t>
+              <w:t>Mapeamento de 19 diplomas nacionais com identificação de tema, cobertura material e impacto esperado. Análise artigo a artigo de 21 artigos do Regulamento 2023/0447 em confronto com legislação nacional. Identificação de correspondências entre Regulamento e legislação nacional (RGBEAC, Código Animal, legislação vigente). Mapeamento de 6 eixos de harmonização: Detenção responsável, Reprodução, Rastreabilidade, Animais errantes, Saúde e bem-estar, Comércio eletrônico. Geração de ferramentas de análise: Excel comparativo artigo a artigo, documentação estruturada de divergências por tema, scripts de integração para atualização contínua.</w:t>
               <w:br/>
               <w:br/>
-              <w:t>⏳ PRÓXIMAS ETAPAS</w:t>
+              <w:t>PRÓXIMAS ETAPAS</w:t>
               <w:br/>
               <w:br/>
-              <w:t>1. Consolidação da proposta de Regime Geral do Bem-Estar dos Animais de Companhia (RGBEAC) com as conclusões da análise comparativa</w:t>
-              <w:br/>
-              <w:t>2. Análise de impacto normativo — efeitos esperados na população animal, operadores económicos, autoridades competentes</w:t>
-              <w:br/>
-              <w:t>3. Alinhamento com o texto final do Regulamento 2023/0447 (esperado Q3/Q4 2026)</w:t>
-              <w:br/>
-              <w:t>4. Participação nas negociações de transposição com a Comissão Europeia e Estados-Membros</w:t>
-              <w:br/>
-              <w:t>5. Consulta pública e articulação com stakeholders (municípios, veterinários, organizações de bem-estar animal, criadores, comerciantes)</w:t>
+              <w:t>Consolidação da proposta de Regime Geral do Bem-Estar dos Animais de Companhia com as conclusões da análise comparativa. Análise de impacto normativo com avaliação dos efeitos esperados na população animal, operadores económicos e autoridades competentes. Alinhamento com o texto final do Regulamento 2023/0447 (esperado segundo semestre de 2026). Participação nas negociações de transposição com a Comissão Europeia e Estados-Membros. Consulta pública e articulação com stakeholders (municípios, veterinários, organizações de bem-estar animal, criadores, comerciantes).</w:t>
               <w:br/>
               <w:br/>
-              <w:t>🔗 RESPONSÁVEL ADMINISTRATIVO</w:t>
+              <w:t>RESPONSÁVEL ADMINISTRATIVO</w:t>
               <w:br/>
               <w:br/>
               <w:t>Direção-Geral de Alimentação e Veterinária (DGAV), Divisão de Bem-Estar Animal</w:t>
-              <w:br/>
-              <w:t>Coordenação: [Nome / Cargo a preencher]</w:t>
             </w:r>
           </w:p>
         </w:tc>

</xml_diff>